<commit_message>
fix: corrige fluxo público do agreement - adiciona clientAccessToken nas URLs
- Adiciona clientAccessToken na interface Record
- Atualiza handleCopyLink para incluir token na URL pública
- Atualiza handleOpenPublic para incluir token na URL pública
- Atualiza chamadas das funções para passar record.clientAccessToken
- Corrige build do dashboard
</commit_message>
<xml_diff>
--- a/docs/PROMPTS.docx
+++ b/docs/PROMPTS.docx
@@ -104,6 +104,43 @@
       </w:r>
       <w:r>
         <w:t>. proibido: quebrar, alterar, excluir, sugerir. precisa seguir o manual.</w:t>
+      </w:r>
+    </w:p>
+    <w:p/>
+    <w:p/>
+    <w:p>
+      <w:r>
+        <w:t>Alguns produtos não podem ser ativados porque os critérios não foram atendidos. Por favor, verifique a seção Critérios do Produto.</w:t>
+      </w:r>
+    </w:p>
+    <w:p/>
+    <w:p>
+      <w:r>
+        <w:t xml:space="preserve">faça um relatório em </w:t>
+      </w:r>
+      <w:proofErr w:type="spellStart"/>
+      <w:r>
+        <w:t>html</w:t>
+      </w:r>
+      <w:proofErr w:type="spellEnd"/>
+      <w:r>
+        <w:t xml:space="preserve"> para salvar em </w:t>
+      </w:r>
+      <w:proofErr w:type="spellStart"/>
+      <w:r>
+        <w:t>pdf</w:t>
+      </w:r>
+      <w:proofErr w:type="spellEnd"/>
+      <w:r>
+        <w:t xml:space="preserve"> de tudo que foi feito nesta seção, </w:t>
+      </w:r>
+      <w:proofErr w:type="gramStart"/>
+      <w:r>
+        <w:t>aonde</w:t>
+      </w:r>
+      <w:proofErr w:type="gramEnd"/>
+      <w:r>
+        <w:t xml:space="preserve"> parou e o que falta fazer </w:t>
       </w:r>
     </w:p>
     <w:p/>
@@ -720,7 +757,6 @@
   <w:style w:type="character" w:default="1" w:styleId="Fontepargpadro">
     <w:name w:val="Default Paragraph Font"/>
     <w:uiPriority w:val="1"/>
-    <w:semiHidden/>
     <w:unhideWhenUsed/>
   </w:style>
   <w:style w:type="table" w:default="1" w:styleId="Tabelanormal">

</xml_diff>

<commit_message>
feat: implementa sistema completo de contratos com hash SHA-256, timeline e envio de e-mails
- Adiciona campos freelancerCity e freelancerState para fórum no contrato
- Implementa formato de data DD/MM/AAAA em todo o sistema
- Adiciona hash SHA-256 de integridade desde a criação do acordo
- Implementa timeline completa em todas as páginas
- Corrige limite de revisões de 3 para 1
- Cria API Route para envio seguro de contratos por e-mail
- Configura e-mail notificado@prejud.com verificado no Resend
- Adiciona redirecionamento de links antigos para nova estrutura
- Corrige encoding UTF-8 em todos os arquivos
- Build: OK

Data: 24/03/2026
</commit_message>
<xml_diff>
--- a/docs/PROMPTS.docx
+++ b/docs/PROMPTS.docx
@@ -110,39 +110,250 @@
     <w:p/>
     <w:p>
       <w:r>
-        <w:t>Alguns produtos não podem ser ativados porque os critérios não foram atendidos. Por favor, verifique a seção Critérios do Produto.</w:t>
+        <w:t xml:space="preserve">faça um relatório em </w:t>
+      </w:r>
+      <w:proofErr w:type="spellStart"/>
+      <w:r>
+        <w:t>html</w:t>
+      </w:r>
+      <w:proofErr w:type="spellEnd"/>
+      <w:r>
+        <w:t xml:space="preserve"> para salvar em </w:t>
+      </w:r>
+      <w:proofErr w:type="spellStart"/>
+      <w:r>
+        <w:t>pdf</w:t>
+      </w:r>
+      <w:proofErr w:type="spellEnd"/>
+      <w:r>
+        <w:t xml:space="preserve"> de tudo que foi feito nesta seção, </w:t>
+      </w:r>
+      <w:proofErr w:type="gramStart"/>
+      <w:r>
+        <w:t>aonde</w:t>
+      </w:r>
+      <w:proofErr w:type="gramEnd"/>
+      <w:r>
+        <w:t xml:space="preserve"> parou e </w:t>
+      </w:r>
+      <w:r>
+        <w:t>de continuidade exatamente de onde parou</w:t>
+      </w:r>
+      <w:r>
+        <w:t xml:space="preserve"> </w:t>
+      </w:r>
+      <w:r>
+        <w:t>seguindo regras do manual</w:t>
+      </w:r>
+    </w:p>
+    <w:p>
+      <w:r>
+        <w:t>EM PAINEL CENTRAL DO FREELANCER</w:t>
+      </w:r>
+    </w:p>
+    <w:p>
+      <w:r>
+        <w:t xml:space="preserve">precisamos criar função rascunho para </w:t>
+      </w:r>
+      <w:proofErr w:type="spellStart"/>
+      <w:r>
+        <w:t>dash</w:t>
+      </w:r>
+      <w:proofErr w:type="spellEnd"/>
+      <w:r>
+        <w:t xml:space="preserve"> do freela</w:t>
+      </w:r>
+      <w:r>
+        <w:br/>
+      </w:r>
+      <w:r>
+        <w:t xml:space="preserve">precisamos criar função </w:t>
+      </w:r>
+      <w:r>
+        <w:t>aguardando cliente</w:t>
+      </w:r>
+      <w:r>
+        <w:t xml:space="preserve"> para </w:t>
+      </w:r>
+      <w:proofErr w:type="spellStart"/>
+      <w:r>
+        <w:t>dash</w:t>
+      </w:r>
+      <w:proofErr w:type="spellEnd"/>
+      <w:r>
+        <w:t xml:space="preserve"> do freela</w:t>
+      </w:r>
+    </w:p>
+    <w:p>
+      <w:r>
+        <w:t xml:space="preserve">precisamos criar função </w:t>
+      </w:r>
+      <w:r>
+        <w:t>acordos ativos</w:t>
+      </w:r>
+      <w:r>
+        <w:t xml:space="preserve"> cliente para </w:t>
+      </w:r>
+      <w:proofErr w:type="spellStart"/>
+      <w:r>
+        <w:t>dash</w:t>
+      </w:r>
+      <w:proofErr w:type="spellEnd"/>
+      <w:r>
+        <w:t xml:space="preserve"> do freela</w:t>
+      </w:r>
+    </w:p>
+    <w:p>
+      <w:r>
+        <w:t xml:space="preserve">precisamos criar função </w:t>
+      </w:r>
+      <w:r>
+        <w:rPr>
+          <w:b/>
+          <w:bCs/>
+        </w:rPr>
+        <w:t>Cobranças pendentes</w:t>
+      </w:r>
+      <w:r>
+        <w:t xml:space="preserve"> cliente para </w:t>
+      </w:r>
+      <w:proofErr w:type="spellStart"/>
+      <w:r>
+        <w:t>dash</w:t>
+      </w:r>
+      <w:proofErr w:type="spellEnd"/>
+      <w:r>
+        <w:t xml:space="preserve"> do freela</w:t>
+      </w:r>
+      <w:r>
+        <w:br/>
+      </w:r>
+    </w:p>
+    <w:p>
+      <w:r>
+        <w:t>EM AÇÕES RÁPIDAS</w:t>
+      </w:r>
+    </w:p>
+    <w:p>
+      <w:r>
+        <w:t xml:space="preserve">precisamos criar função </w:t>
+      </w:r>
+      <w:r>
+        <w:rPr>
+          <w:b/>
+          <w:bCs/>
+        </w:rPr>
+        <w:t xml:space="preserve">enviar convite ao </w:t>
+      </w:r>
+      <w:proofErr w:type="gramStart"/>
+      <w:r>
+        <w:rPr>
+          <w:b/>
+          <w:bCs/>
+        </w:rPr>
+        <w:t>cliente</w:t>
+      </w:r>
+      <w:proofErr w:type="gramEnd"/>
+      <w:r>
+        <w:t xml:space="preserve"> cliente para </w:t>
+      </w:r>
+      <w:proofErr w:type="spellStart"/>
+      <w:r>
+        <w:t>dash</w:t>
+      </w:r>
+      <w:proofErr w:type="spellEnd"/>
+      <w:r>
+        <w:t xml:space="preserve"> do freela</w:t>
+      </w:r>
+      <w:r>
+        <w:br/>
+      </w:r>
+      <w:r>
+        <w:t xml:space="preserve">precisamos criar função </w:t>
+      </w:r>
+      <w:r>
+        <w:rPr>
+          <w:b/>
+          <w:bCs/>
+        </w:rPr>
+        <w:t>Prioridade do momento</w:t>
+      </w:r>
+      <w:r>
+        <w:t xml:space="preserve"> cliente para </w:t>
+      </w:r>
+      <w:proofErr w:type="spellStart"/>
+      <w:r>
+        <w:t>dash</w:t>
+      </w:r>
+      <w:proofErr w:type="spellEnd"/>
+      <w:r>
+        <w:t xml:space="preserve"> do freela</w:t>
+      </w:r>
+    </w:p>
+    <w:p>
+      <w:r>
+        <w:t xml:space="preserve">precisamos criar função </w:t>
+      </w:r>
+      <w:r>
+        <w:rPr>
+          <w:b/>
+          <w:bCs/>
+        </w:rPr>
+        <w:t>gerar cobrança</w:t>
+      </w:r>
+      <w:r>
+        <w:t xml:space="preserve"> cliente para </w:t>
+      </w:r>
+      <w:proofErr w:type="spellStart"/>
+      <w:r>
+        <w:t>dash</w:t>
+      </w:r>
+      <w:proofErr w:type="spellEnd"/>
+      <w:r>
+        <w:t xml:space="preserve"> do freela</w:t>
+      </w:r>
+      <w:r>
+        <w:br/>
+      </w:r>
+      <w:r>
+        <w:t xml:space="preserve">precisamos criar função </w:t>
+      </w:r>
+      <w:r>
+        <w:rPr>
+          <w:b/>
+          <w:bCs/>
+        </w:rPr>
+        <w:t>emitir notificação</w:t>
+      </w:r>
+      <w:r>
+        <w:t xml:space="preserve"> cliente para </w:t>
+      </w:r>
+      <w:proofErr w:type="spellStart"/>
+      <w:r>
+        <w:t>dash</w:t>
+      </w:r>
+      <w:proofErr w:type="spellEnd"/>
+      <w:r>
+        <w:t xml:space="preserve"> do freela</w:t>
+      </w:r>
+      <w:r>
+        <w:br/>
+      </w:r>
+      <w:r>
+        <w:br/>
+      </w:r>
+      <w:r>
+        <w:br/>
+        <w:t>CRIAR FUNÇÃO DE HISTÓRICO RECENTE.</w:t>
+      </w:r>
+      <w:r>
+        <w:br/>
+      </w:r>
+      <w:r>
+        <w:br/>
       </w:r>
     </w:p>
     <w:p/>
-    <w:p>
-      <w:r>
-        <w:t xml:space="preserve">faça um relatório em </w:t>
-      </w:r>
-      <w:proofErr w:type="spellStart"/>
-      <w:r>
-        <w:t>html</w:t>
-      </w:r>
-      <w:proofErr w:type="spellEnd"/>
-      <w:r>
-        <w:t xml:space="preserve"> para salvar em </w:t>
-      </w:r>
-      <w:proofErr w:type="spellStart"/>
-      <w:r>
-        <w:t>pdf</w:t>
-      </w:r>
-      <w:proofErr w:type="spellEnd"/>
-      <w:r>
-        <w:t xml:space="preserve"> de tudo que foi feito nesta seção, </w:t>
-      </w:r>
-      <w:proofErr w:type="gramStart"/>
-      <w:r>
-        <w:t>aonde</w:t>
-      </w:r>
-      <w:proofErr w:type="gramEnd"/>
-      <w:r>
-        <w:t xml:space="preserve"> parou e o que falta fazer </w:t>
-      </w:r>
-    </w:p>
     <w:p/>
     <w:sectPr>
       <w:pgSz w:w="11906" w:h="16838"/>

</xml_diff>